<commit_message>
Drop TL cohort, company-newsletter, and tilde
- Remove "Selected for Halff's Team Leader Training cohort (2023)" line
- Remove "Recognized in company newsletter (2021)..." Centre Park line
- Drop tilde on PM Training cohort: "~26" -> "26"
</commit_message>
<xml_diff>
--- a/Brent_Billington_Resume.docx
+++ b/Brent_Billington_Resume.docx
@@ -268,23 +268,6 @@
     </w:p>
     <w:p>
       <w:pPr>
-        <w:pStyle w:val="ListParagraph"/>
-        <w:numPr>
-          <w:ilvl w:val="0"/>
-          <w:numId w:val="2"/>
-        </w:numPr>
-        <w:spacing w:after="20"/>
-      </w:pPr>
-      <w:r>
-        <w:rPr>
-          <w:sz w:val="20"/>
-          <w:szCs w:val="20"/>
-        </w:rPr>
-        <w:t xml:space="preserve">Selected for Halff's Team Leader Training cohort (2023)</w:t>
-      </w:r>
-    </w:p>
-    <w:p>
-      <w:pPr>
         <w:spacing w:after="40" w:before="80"/>
       </w:pPr>
       <w:r>
@@ -347,7 +330,7 @@
           <w:sz w:val="20"/>
           <w:szCs w:val="20"/>
         </w:rPr>
-        <w:t xml:space="preserve">Selected for Halff's Project Manager Training cohort (2022) — one of ~26 high-performers identified firmwide for accelerated leadership development</w:t>
+        <w:t xml:space="preserve">Selected for Halff’s Project Manager Training cohort (2022) — one of 26 high-performers identified firmwide for accelerated leadership development</w:t>
       </w:r>
     </w:p>
     <w:p>
@@ -415,23 +398,6 @@
           <w:szCs w:val="20"/>
         </w:rPr>
         <w:t xml:space="preserve">Designed Halff's first two-lane roundabout (Choate Parkway, Celina) — passed multiple third-party traffic studies and became internal reference for subsequent designs; trained an EIT on the design who independently led the next two-lane roundabout in Celina</w:t>
-      </w:r>
-    </w:p>
-    <w:p>
-      <w:pPr>
-        <w:pStyle w:val="ListParagraph"/>
-        <w:numPr>
-          <w:ilvl w:val="0"/>
-          <w:numId w:val="2"/>
-        </w:numPr>
-        <w:spacing w:after="20"/>
-      </w:pPr>
-      <w:r>
-        <w:rPr>
-          <w:sz w:val="20"/>
-          <w:szCs w:val="20"/>
-        </w:rPr>
-        <w:t xml:space="preserve">Recognized in company newsletter (2021) for cross-team rescue of Centre Park 20/35 industrial site for the Land Development practice; resulted in repeat business from a new client</w:t>
       </w:r>
     </w:p>
     <w:p>

</xml_diff>

<commit_message>
Add LinkedIn URL to contact line
</commit_message>
<xml_diff>
--- a/Brent_Billington_Resume.docx
+++ b/Brent_Billington_Resume.docx
@@ -62,6 +62,21 @@
           <w:szCs w:val="20"/>
         </w:rPr>
         <w:t xml:space="preserve">brent.billington@gmail.com</w:t>
+      </w:r>
+      <w:r>
+        <w:rPr>
+          <w:color w:val="595959"/>
+          <w:sz w:val="20"/>
+          <w:szCs w:val="20"/>
+        </w:rPr>
+        <w:t xml:space="preserve">  ·  </w:t>
+      </w:r>
+      <w:r>
+        <w:rPr>
+          <w:sz w:val="20"/>
+          <w:szCs w:val="20"/>
+        </w:rPr>
+        <w:t xml:space="preserve">linkedin.com/in/brentbillington</w:t>
       </w:r>
     </w:p>
     <w:p>

</xml_diff>